<commit_message>
Privacy policy v5: tighten to 2 pages, scannable, all requirements retained
</commit_message>
<xml_diff>
--- a/RegionalAR Privacy Policy.docx
+++ b/RegionalAR Privacy Policy.docx
@@ -8,7 +8,7 @@
         <w:pBdr>
           <w:bottom w:val="single" w:color="0066CC" w:sz="12" w:space="4"/>
         </w:pBdr>
-        <w:spacing w:after="120"/>
+        <w:spacing w:after="60"/>
       </w:pPr>
       <w:r>
         <w:rPr>
@@ -22,71 +22,49 @@
     </w:p>
     <w:p>
       <w:pPr>
-        <w:spacing w:after="240"/>
+        <w:spacing w:after="200"/>
       </w:pPr>
       <w:r>
         <w:rPr>
           <w:i/>
           <w:iCs/>
           <w:color w:val="666666"/>
-        </w:rPr>
-        <w:t xml:space="preserve">Last updated: April 27, 2026</w:t>
-      </w:r>
-    </w:p>
-    <w:p>
-      <w:pPr>
-        <w:spacing w:after="120"/>
-      </w:pPr>
-      <w:r>
-        <w:t xml:space="preserve">RegionalAR ("the App") is a medical imaging visualization tool for Meta Quest developed by Laurence Henson, MD. This privacy policy explains what data the App collects, how it is used, how it is stored, and how you can request its deletion.</w:t>
+          <w:sz w:val="20"/>
+          <w:szCs w:val="20"/>
+        </w:rPr>
+        <w:t xml:space="preserve">Last updated: April 30, 2026</w:t>
+      </w:r>
+    </w:p>
+    <w:p>
+      <w:pPr>
+        <w:spacing w:after="120"/>
+      </w:pPr>
+      <w:r>
+        <w:t xml:space="preserve">RegionalAR is a medical imaging viewer for Meta Quest, developed by Laurence Henson, MD. This policy explains the data the App collects, how it is used, and how you can access, correct, or delete it.</w:t>
       </w:r>
     </w:p>
     <w:p>
       <w:pPr>
         <w:pStyle w:val="Heading2"/>
-        <w:spacing w:after="140" w:before="280"/>
+        <w:spacing w:after="100" w:before="240"/>
       </w:pPr>
       <w:r>
         <w:rPr>
           <w:b/>
           <w:bCs/>
           <w:color w:val="0066CC"/>
-          <w:sz w:val="28"/>
-          <w:szCs w:val="28"/>
-        </w:rPr>
-        <w:t xml:space="preserve">Summary</w:t>
-      </w:r>
-    </w:p>
-    <w:p>
-      <w:pPr>
-        <w:spacing w:after="120"/>
-      </w:pPr>
-      <w:r>
-        <w:t xml:space="preserve">RegionalAR does not collect medical imaging data, usage analytics, or personally identifying information directly. The App does, however, use Meta Horizon Platform features to verify in-app purchases and apply age-appropriate access. The data fields used by these features are described in detail below.</w:t>
-      </w:r>
-    </w:p>
-    <w:p>
-      <w:pPr>
-        <w:pStyle w:val="Heading2"/>
-        <w:spacing w:after="140" w:before="280"/>
-      </w:pPr>
-      <w:r>
-        <w:rPr>
-          <w:b/>
-          <w:bCs/>
-          <w:color w:val="0066CC"/>
-          <w:sz w:val="28"/>
-          <w:szCs w:val="28"/>
-        </w:rPr>
-        <w:t xml:space="preserve">Data Collected via Meta Horizon Platform</w:t>
-      </w:r>
-    </w:p>
-    <w:p>
-      <w:pPr>
-        <w:spacing w:after="120"/>
-      </w:pPr>
-      <w:r>
-        <w:t xml:space="preserve">To support in-app purchases and age-appropriate access on Meta Quest, the App requests the following Platform Features. The data is provided to the App by the Meta Horizon Platform; the App does not collect this data independently.</w:t>
+          <w:sz w:val="26"/>
+          <w:szCs w:val="26"/>
+        </w:rPr>
+        <w:t xml:space="preserve">What We Collect</w:t>
+      </w:r>
+    </w:p>
+    <w:p>
+      <w:pPr>
+        <w:spacing w:after="120"/>
+      </w:pPr>
+      <w:r>
+        <w:t xml:space="preserve">Through the Meta Horizon Platform, RegionalAR collects only the following:</w:t>
       </w:r>
     </w:p>
     <w:tbl>
@@ -102,10 +80,9 @@
         </w:tblBorders>
       </w:tblPr>
       <w:tblGrid>
-        <w:gridCol w:w="1700"/>
-        <w:gridCol w:w="2900"/>
-        <w:gridCol w:w="2900"/>
-        <w:gridCol w:w="1860"/>
+        <w:gridCol w:w="2500"/>
+        <w:gridCol w:w="3700"/>
+        <w:gridCol w:w="3160"/>
       </w:tblGrid>
       <w:tr>
         <w:trPr>
@@ -113,7 +90,7 @@
         </w:trPr>
         <w:tc>
           <w:tcPr>
-            <w:tcW w:type="dxa" w:w="1700"/>
+            <w:tcW w:type="dxa" w:w="2500"/>
             <w:tcBorders>
               <w:top w:val="single" w:color="CCCCCC" w:sz="1"/>
               <w:left w:val="single" w:color="CCCCCC" w:sz="1"/>
@@ -134,13 +111,13 @@
                 <w:b/>
                 <w:bCs/>
               </w:rPr>
-              <w:t xml:space="preserve">Data Field</w:t>
+              <w:t xml:space="preserve">Data</w:t>
             </w:r>
           </w:p>
         </w:tc>
         <w:tc>
           <w:tcPr>
-            <w:tcW w:type="dxa" w:w="2900"/>
+            <w:tcW w:type="dxa" w:w="3700"/>
             <w:tcBorders>
               <w:top w:val="single" w:color="CCCCCC" w:sz="1"/>
               <w:left w:val="single" w:color="CCCCCC" w:sz="1"/>
@@ -161,13 +138,13 @@
                 <w:b/>
                 <w:bCs/>
               </w:rPr>
-              <w:t xml:space="preserve">What Is Collected</w:t>
+              <w:t xml:space="preserve">Purpose</w:t>
             </w:r>
           </w:p>
         </w:tc>
         <w:tc>
           <w:tcPr>
-            <w:tcW w:type="dxa" w:w="2900"/>
+            <w:tcW w:type="dxa" w:w="3160"/>
             <w:tcBorders>
               <w:top w:val="single" w:color="CCCCCC" w:sz="1"/>
               <w:left w:val="single" w:color="CCCCCC" w:sz="1"/>
@@ -188,34 +165,7 @@
                 <w:b/>
                 <w:bCs/>
               </w:rPr>
-              <w:t xml:space="preserve">How It Is Used</w:t>
-            </w:r>
-          </w:p>
-        </w:tc>
-        <w:tc>
-          <w:tcPr>
-            <w:tcW w:type="dxa" w:w="1860"/>
-            <w:tcBorders>
-              <w:top w:val="single" w:color="CCCCCC" w:sz="1"/>
-              <w:left w:val="single" w:color="CCCCCC" w:sz="1"/>
-              <w:bottom w:val="single" w:color="CCCCCC" w:sz="1"/>
-              <w:right w:val="single" w:color="CCCCCC" w:sz="1"/>
-            </w:tcBorders>
-            <w:shd w:fill="F0F0F0" w:val="clear"/>
-            <w:tcMar>
-              <w:top w:type="dxa" w:w="80"/>
-              <w:left w:type="dxa" w:w="120"/>
-              <w:bottom w:type="dxa" w:w="80"/>
-              <w:right w:type="dxa" w:w="120"/>
-            </w:tcMar>
-          </w:tcPr>
-          <w:p>
-            <w:r>
-              <w:rPr>
-                <w:b/>
-                <w:bCs/>
-              </w:rPr>
-              <w:t xml:space="preserve">Where It Is Stored</w:t>
+              <w:t xml:space="preserve">Storage</w:t>
             </w:r>
           </w:p>
         </w:tc>
@@ -223,7 +173,7 @@
       <w:tr>
         <w:tc>
           <w:tcPr>
-            <w:tcW w:type="dxa" w:w="1700"/>
+            <w:tcW w:type="dxa" w:w="2500"/>
             <w:tcBorders>
               <w:top w:val="single" w:color="CCCCCC" w:sz="1"/>
               <w:left w:val="single" w:color="CCCCCC" w:sz="1"/>
@@ -243,13 +193,16 @@
                 <w:b/>
                 <w:bCs/>
               </w:rPr>
-              <w:t xml:space="preserve">USER_ID</w:t>
+              <w:t xml:space="preserve">User ID </w:t>
+            </w:r>
+            <w:r>
+              <w:t xml:space="preserve">(anonymous, app-scoped)</w:t>
             </w:r>
           </w:p>
         </w:tc>
         <w:tc>
           <w:tcPr>
-            <w:tcW w:type="dxa" w:w="2900"/>
+            <w:tcW w:type="dxa" w:w="3700"/>
             <w:tcBorders>
               <w:top w:val="single" w:color="CCCCCC" w:sz="1"/>
               <w:left w:val="single" w:color="CCCCCC" w:sz="1"/>
@@ -265,13 +218,13 @@
           </w:tcPr>
           <w:p>
             <w:r>
-              <w:t xml:space="preserve">An anonymous, app-scoped Meta user identifier provided by the Oculus Platform SDK.</w:t>
+              <w:t xml:space="preserve">Verify in-app purchase entitlement and generate a license key for the optional Desktop Companion.</w:t>
             </w:r>
           </w:p>
         </w:tc>
         <w:tc>
           <w:tcPr>
-            <w:tcW w:type="dxa" w:w="2900"/>
+            <w:tcW w:type="dxa" w:w="3160"/>
             <w:tcBorders>
               <w:top w:val="single" w:color="CCCCCC" w:sz="1"/>
               <w:left w:val="single" w:color="CCCCCC" w:sz="1"/>
@@ -287,13 +240,15 @@
           </w:tcPr>
           <w:p>
             <w:r>
-              <w:t xml:space="preserve">Used solely to verify entitlement to the optional Desktop Companion in-app purchase, and to generate a license key bound to that entitlement so the user can activate the desktop application they have purchased.</w:t>
+              <w:t xml:space="preserve">Held in memory during the session only. Never written to disk. Never sent off-device.</w:t>
             </w:r>
           </w:p>
         </w:tc>
+      </w:tr>
+      <w:tr>
         <w:tc>
           <w:tcPr>
-            <w:tcW w:type="dxa" w:w="1860"/>
+            <w:tcW w:type="dxa" w:w="2500"/>
             <w:tcBorders>
               <w:top w:val="single" w:color="CCCCCC" w:sz="1"/>
               <w:left w:val="single" w:color="CCCCCC" w:sz="1"/>
@@ -309,15 +264,20 @@
           </w:tcPr>
           <w:p>
             <w:r>
-              <w:t xml:space="preserve">Held in memory only during the app session. Not transmitted to any server operated by the developer. Not written to persistent storage.</w:t>
+              <w:rPr>
+                <w:b/>
+                <w:bCs/>
+              </w:rPr>
+              <w:t xml:space="preserve">Age Category </w:t>
+            </w:r>
+            <w:r>
+              <w:t xml:space="preserve">(e.g., adult / teen)</w:t>
             </w:r>
           </w:p>
         </w:tc>
-      </w:tr>
-      <w:tr>
         <w:tc>
           <w:tcPr>
-            <w:tcW w:type="dxa" w:w="1700"/>
+            <w:tcW w:type="dxa" w:w="3700"/>
             <w:tcBorders>
               <w:top w:val="single" w:color="CCCCCC" w:sz="1"/>
               <w:left w:val="single" w:color="CCCCCC" w:sz="1"/>
@@ -333,17 +293,13 @@
           </w:tcPr>
           <w:p>
             <w:r>
-              <w:rPr>
-                <w:b/>
-                <w:bCs/>
-              </w:rPr>
-              <w:t xml:space="preserve">USER_AGE (Age Category)</w:t>
+              <w:t xml:space="preserve">Confirm minimum age before showing anatomical content.</w:t>
             </w:r>
           </w:p>
         </w:tc>
         <w:tc>
           <w:tcPr>
-            <w:tcW w:type="dxa" w:w="2900"/>
+            <w:tcW w:type="dxa" w:w="3160"/>
             <w:tcBorders>
               <w:top w:val="single" w:color="CCCCCC" w:sz="1"/>
               <w:left w:val="single" w:color="CCCCCC" w:sz="1"/>
@@ -359,13 +315,15 @@
           </w:tcPr>
           <w:p>
             <w:r>
-              <w:t xml:space="preserve">An age category (e.g., teen / adult) provided by the Meta Horizon Platform. The App does not receive a date of birth or exact age.</w:t>
+              <w:t xml:space="preserve">Held in memory during the session only. Never written to disk. Never sent off-device.</w:t>
             </w:r>
           </w:p>
         </w:tc>
+      </w:tr>
+      <w:tr>
         <w:tc>
           <w:tcPr>
-            <w:tcW w:type="dxa" w:w="2900"/>
+            <w:tcW w:type="dxa" w:w="2500"/>
             <w:tcBorders>
               <w:top w:val="single" w:color="CCCCCC" w:sz="1"/>
               <w:left w:val="single" w:color="CCCCCC" w:sz="1"/>
@@ -381,13 +339,17 @@
           </w:tcPr>
           <w:p>
             <w:r>
-              <w:t xml:space="preserve">Used to confirm the user meets the minimum age for medical educational content prior to displaying anatomical visualizations.</w:t>
+              <w:rPr>
+                <w:b/>
+                <w:bCs/>
+              </w:rPr>
+              <w:t xml:space="preserve">In-App Purchase status</w:t>
             </w:r>
           </w:p>
         </w:tc>
         <w:tc>
           <w:tcPr>
-            <w:tcW w:type="dxa" w:w="1860"/>
+            <w:tcW w:type="dxa" w:w="3700"/>
             <w:tcBorders>
               <w:top w:val="single" w:color="CCCCCC" w:sz="1"/>
               <w:left w:val="single" w:color="CCCCCC" w:sz="1"/>
@@ -403,15 +365,13 @@
           </w:tcPr>
           <w:p>
             <w:r>
-              <w:t xml:space="preserve">Held in memory only during the app session. Not stored, logged, or transmitted.</w:t>
+              <w:t xml:space="preserve">Determine whether to show the license activation panel for the Desktop Companion ($9.99 add-on).</w:t>
             </w:r>
           </w:p>
         </w:tc>
-      </w:tr>
-      <w:tr>
         <w:tc>
           <w:tcPr>
-            <w:tcW w:type="dxa" w:w="1700"/>
+            <w:tcW w:type="dxa" w:w="3160"/>
             <w:tcBorders>
               <w:top w:val="single" w:color="CCCCCC" w:sz="1"/>
               <w:left w:val="single" w:color="CCCCCC" w:sz="1"/>
@@ -427,77 +387,7 @@
           </w:tcPr>
           <w:p>
             <w:r>
-              <w:rPr>
-                <w:b/>
-                <w:bCs/>
-              </w:rPr>
-              <w:t xml:space="preserve">IN_APP_PURCHASES (IAP)</w:t>
-            </w:r>
-          </w:p>
-        </w:tc>
-        <w:tc>
-          <w:tcPr>
-            <w:tcW w:type="dxa" w:w="2900"/>
-            <w:tcBorders>
-              <w:top w:val="single" w:color="CCCCCC" w:sz="1"/>
-              <w:left w:val="single" w:color="CCCCCC" w:sz="1"/>
-              <w:bottom w:val="single" w:color="CCCCCC" w:sz="1"/>
-              <w:right w:val="single" w:color="CCCCCC" w:sz="1"/>
-            </w:tcBorders>
-            <w:tcMar>
-              <w:top w:type="dxa" w:w="80"/>
-              <w:left w:type="dxa" w:w="120"/>
-              <w:bottom w:type="dxa" w:w="80"/>
-              <w:right w:type="dxa" w:w="120"/>
-            </w:tcMar>
-          </w:tcPr>
-          <w:p>
-            <w:r>
-              <w:t xml:space="preserve">Purchase status of the optional Desktop Companion add-on (SKU: desktop_license), as reported by the Oculus Platform SDK.</w:t>
-            </w:r>
-          </w:p>
-        </w:tc>
-        <w:tc>
-          <w:tcPr>
-            <w:tcW w:type="dxa" w:w="2900"/>
-            <w:tcBorders>
-              <w:top w:val="single" w:color="CCCCCC" w:sz="1"/>
-              <w:left w:val="single" w:color="CCCCCC" w:sz="1"/>
-              <w:bottom w:val="single" w:color="CCCCCC" w:sz="1"/>
-              <w:right w:val="single" w:color="CCCCCC" w:sz="1"/>
-            </w:tcBorders>
-            <w:tcMar>
-              <w:top w:type="dxa" w:w="80"/>
-              <w:left w:type="dxa" w:w="120"/>
-              <w:bottom w:type="dxa" w:w="80"/>
-              <w:right w:type="dxa" w:w="120"/>
-            </w:tcMar>
-          </w:tcPr>
-          <w:p>
-            <w:r>
-              <w:t xml:space="preserve">Used to determine whether to display the license activation panel inside the App. The license key generated for activation is derived locally on-device using the user's Meta-provided USER_ID and a developer secret; no purchase information is sent off-device.</w:t>
-            </w:r>
-          </w:p>
-        </w:tc>
-        <w:tc>
-          <w:tcPr>
-            <w:tcW w:type="dxa" w:w="1860"/>
-            <w:tcBorders>
-              <w:top w:val="single" w:color="CCCCCC" w:sz="1"/>
-              <w:left w:val="single" w:color="CCCCCC" w:sz="1"/>
-              <w:bottom w:val="single" w:color="CCCCCC" w:sz="1"/>
-              <w:right w:val="single" w:color="CCCCCC" w:sz="1"/>
-            </w:tcBorders>
-            <w:tcMar>
-              <w:top w:type="dxa" w:w="80"/>
-              <w:left w:type="dxa" w:w="120"/>
-              <w:bottom w:type="dxa" w:w="80"/>
-              <w:right w:type="dxa" w:w="120"/>
-            </w:tcMar>
-          </w:tcPr>
-          <w:p>
-            <w:r>
-              <w:t xml:space="preserve">Purchase status is fetched from Meta on demand. The generated license key is shown on screen so the user can enter it into the Desktop Companion. It is not transmitted by the Quest app to any third party.</w:t>
+              <w:t xml:space="preserve">Fetched from Meta on demand. License key generated on-device using HMAC-SHA256.</w:t>
             </w:r>
           </w:p>
         </w:tc>
@@ -516,31 +406,21 @@
         <w:spacing w:after="120"/>
       </w:pPr>
       <w:r>
-        <w:t xml:space="preserve">The App does </w:t>
-      </w:r>
-      <w:r>
-        <w:rPr>
-          <w:b/>
-          <w:bCs/>
-        </w:rPr>
-        <w:t xml:space="preserve">not</w:t>
-      </w:r>
-      <w:r>
-        <w:t xml:space="preserve"> use DEVICE_BAN, ad identifiers, location data, voice data, hand or eye tracking data, microphone data, photographs, or contact lists.</w:t>
+        <w:t xml:space="preserve">The App requests no other categories of data — no analytics, telemetry, location, voice, eye/hand/face tracking, microphone, photos, contacts, advertising IDs, or persistent device IDs.</w:t>
       </w:r>
     </w:p>
     <w:p>
       <w:pPr>
         <w:pStyle w:val="Heading2"/>
-        <w:spacing w:after="140" w:before="280"/>
+        <w:spacing w:after="100" w:before="240"/>
       </w:pPr>
       <w:r>
         <w:rPr>
           <w:b/>
           <w:bCs/>
           <w:color w:val="0066CC"/>
-          <w:sz w:val="28"/>
-          <w:szCs w:val="28"/>
+          <w:sz w:val="26"/>
+          <w:szCs w:val="26"/>
         </w:rPr>
         <w:t xml:space="preserve">Medical Imaging Data</w:t>
       </w:r>
@@ -550,7 +430,138 @@
         <w:spacing w:after="120"/>
       </w:pPr>
       <w:r>
-        <w:t xml:space="preserve">DICOM/MRI/CT scan data that you process with the optional RegionalAR Desktop Companion is handled entirely on your own computer and your own Meta Quest headset:</w:t>
+        <w:t xml:space="preserve">Any DICOM/CT/MRI scans you view in the App are transferred from your own PC to your own Quest over your local Wi-Fi only. Scan data never leaves your devices, is never associated with your Meta account, and is never sent to the developer, Meta, or any third party.</w:t>
+      </w:r>
+    </w:p>
+    <w:p>
+      <w:pPr>
+        <w:pStyle w:val="Heading2"/>
+        <w:spacing w:after="100" w:before="240"/>
+      </w:pPr>
+      <w:r>
+        <w:rPr>
+          <w:b/>
+          <w:bCs/>
+          <w:color w:val="0066CC"/>
+          <w:sz w:val="26"/>
+          <w:szCs w:val="26"/>
+        </w:rPr>
+        <w:t xml:space="preserve">Data Retention</w:t>
+      </w:r>
+    </w:p>
+    <w:p>
+      <w:pPr>
+        <w:spacing w:after="120"/>
+      </w:pPr>
+      <w:r>
+        <w:t xml:space="preserve">Platform data (User ID, age category, IAP status) is held in device memory for the duration of an app session and discarded when the App closes. The optional Desktop Companion stores one local file on your PC (</w:t>
+      </w:r>
+      <w:r>
+        <w:rPr>
+          <w:rFonts w:ascii="Consolas" w:cs="Consolas" w:eastAsia="Consolas" w:hAnsi="Consolas"/>
+        </w:rPr>
+        <w:t xml:space="preserve">.regionalar_license</w:t>
+      </w:r>
+      <w:r>
+        <w:t xml:space="preserve">) containing a license key generated on-device; you can delete it at any time.</w:t>
+      </w:r>
+    </w:p>
+    <w:p>
+      <w:pPr>
+        <w:pStyle w:val="Heading2"/>
+        <w:spacing w:after="100" w:before="240"/>
+      </w:pPr>
+      <w:r>
+        <w:rPr>
+          <w:b/>
+          <w:bCs/>
+          <w:color w:val="0066CC"/>
+          <w:sz w:val="26"/>
+          <w:szCs w:val="26"/>
+        </w:rPr>
+        <w:t xml:space="preserve">Data Security</w:t>
+      </w:r>
+    </w:p>
+    <w:p>
+      <w:pPr>
+        <w:spacing w:after="120"/>
+      </w:pPr>
+      <w:r>
+        <w:t xml:space="preserve">The App has no developer-operated backend or database — there is no server-side store of user data to compromise. All Platform data is processed on-device. Communication between the Desktop Companion and the Quest occurs only on your local network. The Quest App is distributed only via the Meta Horizon Store; the Desktop Companion only via signed releases at </w:t>
+      </w:r>
+      <w:hyperlink w:history="1" r:id="rIddxvgzhvdm1k5g3cwtjq_o">
+        <w:r>
+          <w:rPr>
+            <w:rStyle w:val="Hyperlink"/>
+            <w:color w:val="0066CC"/>
+            <w:u w:val="single"/>
+          </w:rPr>
+          <w:t xml:space="preserve">github.com/cyrilhenson/RegionalAR/releases</w:t>
+        </w:r>
+      </w:hyperlink>
+      <w:r>
+        <w:t xml:space="preserve">. To report a security issue, email the address in the Contact section.</w:t>
+      </w:r>
+    </w:p>
+    <w:p>
+      <w:pPr>
+        <w:pStyle w:val="Heading2"/>
+        <w:spacing w:after="100" w:before="240"/>
+      </w:pPr>
+      <w:r>
+        <w:rPr>
+          <w:b/>
+          <w:bCs/>
+          <w:color w:val="0066CC"/>
+          <w:sz w:val="26"/>
+          <w:szCs w:val="26"/>
+        </w:rPr>
+        <w:t xml:space="preserve">Data Sharing</w:t>
+      </w:r>
+    </w:p>
+    <w:p>
+      <w:pPr>
+        <w:spacing w:after="120"/>
+      </w:pPr>
+      <w:r>
+        <w:t xml:space="preserve">The developer does not sell, share, or transfer user data to any third party, and does not use any Service Providers to process Meta Horizon User Data. Meta supplies the Platform data described above; your relationship with Meta is governed by </w:t>
+      </w:r>
+      <w:hyperlink w:history="1" r:id="rIdwf0bnj7exqaqnarbqfxtq">
+        <w:r>
+          <w:rPr>
+            <w:rStyle w:val="Hyperlink"/>
+            <w:color w:val="0066CC"/>
+            <w:u w:val="single"/>
+          </w:rPr>
+          <w:t xml:space="preserve">Meta's privacy policy</w:t>
+        </w:r>
+      </w:hyperlink>
+      <w:r>
+        <w:t xml:space="preserve">.</w:t>
+      </w:r>
+    </w:p>
+    <w:p>
+      <w:pPr>
+        <w:pStyle w:val="Heading2"/>
+        <w:spacing w:after="100" w:before="240"/>
+      </w:pPr>
+      <w:r>
+        <w:rPr>
+          <w:b/>
+          <w:bCs/>
+          <w:color w:val="0066CC"/>
+          <w:sz w:val="26"/>
+          <w:szCs w:val="26"/>
+        </w:rPr>
+        <w:t xml:space="preserve">Your Rights: Access, Correction, Deletion</w:t>
+      </w:r>
+    </w:p>
+    <w:p>
+      <w:pPr>
+        <w:spacing w:after="120"/>
+      </w:pPr>
+      <w:r>
+        <w:t xml:space="preserve">All users, regardless of country of residence, may exercise the rights below at any time, free of charge, with no required justification.</w:t>
       </w:r>
     </w:p>
     <w:p>
@@ -563,7 +574,14 @@
         <w:spacing w:after="80"/>
       </w:pPr>
       <w:r>
-        <w:t xml:space="preserve">Scan files are read by the Desktop Companion locally on your PC.</w:t>
+        <w:rPr>
+          <w:b/>
+          <w:bCs/>
+        </w:rPr>
+        <w:t xml:space="preserve">Access</w:t>
+      </w:r>
+      <w:r>
+        <w:t xml:space="preserve"> — The data collected is itemized in the table above. To confirm what was accessed under your account, email the developer.</w:t>
       </w:r>
     </w:p>
     <w:p>
@@ -576,7 +594,27 @@
         <w:spacing w:after="80"/>
       </w:pPr>
       <w:r>
-        <w:t xml:space="preserve">Processed volume files are transferred to the Quest only over your local Wi-Fi network, using direct device-to-device communication.</w:t>
+        <w:rPr>
+          <w:b/>
+          <w:bCs/>
+        </w:rPr>
+        <w:t xml:space="preserve">Correction</w:t>
+      </w:r>
+      <w:r>
+        <w:t xml:space="preserve"> — Platform data originates with Meta. Update it at </w:t>
+      </w:r>
+      <w:hyperlink w:history="1" r:id="rIdzhrmuisp_kl9iyrq7ei6c">
+        <w:r>
+          <w:rPr>
+            <w:rStyle w:val="Hyperlink"/>
+            <w:color w:val="0066CC"/>
+            <w:u w:val="single"/>
+          </w:rPr>
+          <w:t xml:space="preserve">accountscenter.meta.com</w:t>
+        </w:r>
+      </w:hyperlink>
+      <w:r>
+        <w:t xml:space="preserve">; corrected values flow through on your next session. For other corrections, email the developer.</w:t>
       </w:r>
     </w:p>
     <w:p>
@@ -589,236 +627,125 @@
         <w:spacing w:after="80"/>
       </w:pPr>
       <w:r>
-        <w:t xml:space="preserve">No medical imaging data is sent to the developer, to Meta, to any cloud service, or to any third party.</w:t>
-      </w:r>
-    </w:p>
-    <w:p>
-      <w:pPr>
-        <w:pStyle w:val="ListParagraph"/>
-        <w:numPr>
-          <w:ilvl w:val="0"/>
-          <w:numId w:val="2"/>
-        </w:numPr>
-        <w:spacing w:after="80"/>
-      </w:pPr>
-      <w:r>
-        <w:t xml:space="preserve">No medical imaging data is associated with your Meta account or with USER_ID.</w:t>
-      </w:r>
-    </w:p>
-    <w:p>
-      <w:pPr>
-        <w:pStyle w:val="Heading2"/>
-        <w:spacing w:after="140" w:before="280"/>
-      </w:pPr>
-      <w:r>
-        <w:rPr>
-          <w:b/>
-          <w:bCs/>
-          <w:color w:val="0066CC"/>
-          <w:sz w:val="28"/>
-          <w:szCs w:val="28"/>
-        </w:rPr>
-        <w:t xml:space="preserve">Network Usage</w:t>
-      </w:r>
-    </w:p>
-    <w:p>
-      <w:pPr>
-        <w:spacing w:after="120"/>
-      </w:pPr>
-      <w:r>
-        <w:t xml:space="preserve">The Quest App's only network use is local-network discovery (UDP broadcast) and local-network file download (HTTP) from the Desktop Companion. The App does not connect to remote servers operated by the developer, does not include analytics, and does not transmit usage data over the internet.</w:t>
-      </w:r>
-    </w:p>
-    <w:p>
-      <w:pPr>
-        <w:pStyle w:val="Heading2"/>
-        <w:spacing w:after="140" w:before="280"/>
-      </w:pPr>
-      <w:r>
-        <w:rPr>
-          <w:b/>
-          <w:bCs/>
-          <w:color w:val="0066CC"/>
-          <w:sz w:val="28"/>
-          <w:szCs w:val="28"/>
-        </w:rPr>
-        <w:t xml:space="preserve">Analytics and Tracking</w:t>
-      </w:r>
-    </w:p>
-    <w:p>
-      <w:pPr>
-        <w:spacing w:after="120"/>
-      </w:pPr>
-      <w:r>
-        <w:t xml:space="preserve">RegionalAR does not include analytics, telemetry, crash reporting, advertising SDKs, or any third-party tracking software. No usage data is collected or shared with the developer or any third party.</w:t>
-      </w:r>
-    </w:p>
-    <w:p>
-      <w:pPr>
-        <w:pStyle w:val="Heading2"/>
-        <w:spacing w:after="140" w:before="280"/>
-      </w:pPr>
-      <w:r>
-        <w:rPr>
-          <w:b/>
-          <w:bCs/>
-          <w:color w:val="0066CC"/>
-          <w:sz w:val="28"/>
-          <w:szCs w:val="28"/>
-        </w:rPr>
-        <w:t xml:space="preserve">Data Retention</w:t>
-      </w:r>
-    </w:p>
-    <w:p>
-      <w:pPr>
-        <w:spacing w:after="120"/>
-      </w:pPr>
-      <w:r>
-        <w:t xml:space="preserve">The developer does not retain any user data, because the developer does not receive any user data. All Platform Feature data (USER_ID, age category, IAP status) is provided by the Meta Horizon Platform on demand and held only in memory during the App session.</w:t>
-      </w:r>
-    </w:p>
-    <w:p>
-      <w:pPr>
-        <w:pStyle w:val="Heading2"/>
-        <w:spacing w:after="140" w:before="280"/>
-      </w:pPr>
-      <w:r>
-        <w:rPr>
-          <w:b/>
-          <w:bCs/>
-          <w:color w:val="0066CC"/>
-          <w:sz w:val="28"/>
-          <w:szCs w:val="28"/>
-        </w:rPr>
-        <w:t xml:space="preserve">Your Right to Request Deletion</w:t>
-      </w:r>
-    </w:p>
-    <w:p>
-      <w:pPr>
-        <w:spacing w:after="120"/>
-      </w:pPr>
-      <w:r>
-        <w:t xml:space="preserve">Because the developer does not store user data on any server, there is no developer-held data to delete. You can, however, fully remove all locally-held App data and revoke the App's access to your Meta account using the following methods:</w:t>
-      </w:r>
-    </w:p>
-    <w:p>
-      <w:pPr>
-        <w:pStyle w:val="Heading3"/>
-        <w:spacing w:after="100" w:before="200"/>
-      </w:pPr>
-      <w:r>
-        <w:rPr>
-          <w:b/>
-          <w:bCs/>
-          <w:color w:val="444444"/>
-          <w:sz w:val="24"/>
-          <w:szCs w:val="24"/>
-        </w:rPr>
-        <w:t xml:space="preserve">1. Delete data stored on your Quest device</w:t>
-      </w:r>
-    </w:p>
-    <w:p>
-      <w:pPr>
-        <w:spacing w:after="120"/>
-      </w:pPr>
-      <w:r>
-        <w:t xml:space="preserve">Uninstall RegionalAR from your Meta Quest 3 (Apps → RegionalAR → ⋮ → Uninstall). This deletes all downloaded scan volumes, cached settings, and any locally generated license data from your device.</w:t>
-      </w:r>
-    </w:p>
-    <w:p>
-      <w:pPr>
-        <w:pStyle w:val="Heading3"/>
-        <w:spacing w:after="100" w:before="200"/>
-      </w:pPr>
-      <w:r>
-        <w:rPr>
-          <w:b/>
-          <w:bCs/>
-          <w:color w:val="444444"/>
-          <w:sz w:val="24"/>
-          <w:szCs w:val="24"/>
-        </w:rPr>
-        <w:t xml:space="preserve">2. Revoke Meta Horizon Platform access</w:t>
-      </w:r>
-    </w:p>
-    <w:p>
-      <w:pPr>
-        <w:spacing w:after="120"/>
-      </w:pPr>
-      <w:r>
-        <w:t xml:space="preserve">You can remove RegionalAR's access to your Meta account at any time through Meta's standard account controls: </w:t>
-      </w:r>
-      <w:hyperlink w:history="1" r:id="rIdtm2gpivftobpohmamkgzm">
+        <w:rPr>
+          <w:b/>
+          <w:bCs/>
+        </w:rPr>
+        <w:t xml:space="preserve">Deletion</w:t>
+      </w:r>
+      <w:r>
+        <w:t xml:space="preserve"> — Exiting the App clears in-memory data. Uninstalling RegionalAR removes any local files. Revoking app access at </w:t>
+      </w:r>
+      <w:hyperlink w:history="1" r:id="rIdfd-_wztgbvaz_uw6her4r">
         <w:r>
           <w:rPr>
             <w:rStyle w:val="Hyperlink"/>
             <w:color w:val="0066CC"/>
             <w:u w:val="single"/>
           </w:rPr>
-          <w:t xml:space="preserve">https://accountscenter.meta.com/</w:t>
+          <w:t xml:space="preserve">accountscenter.meta.com → Apps and websites</w:t>
         </w:r>
       </w:hyperlink>
       <w:r>
-        <w:t xml:space="preserve"> → Apps and websites → Active. This stops the Meta Platform from providing USER_ID, age category, or IAP status to the App.</w:t>
-      </w:r>
-    </w:p>
-    <w:p>
-      <w:pPr>
-        <w:pStyle w:val="Heading3"/>
-        <w:spacing w:after="100" w:before="200"/>
-      </w:pPr>
-      <w:r>
-        <w:rPr>
-          <w:b/>
-          <w:bCs/>
-          <w:color w:val="444444"/>
-          <w:sz w:val="24"/>
-          <w:szCs w:val="24"/>
-        </w:rPr>
-        <w:t xml:space="preserve">3. Delete data stored by the Desktop Companion</w:t>
-      </w:r>
-    </w:p>
-    <w:p>
-      <w:pPr>
-        <w:spacing w:after="120"/>
-      </w:pPr>
-      <w:r>
-        <w:t xml:space="preserve">The Desktop Companion stores its activation state in a file named </w:t>
-      </w:r>
-      <w:r>
-        <w:rPr>
-          <w:rFonts w:ascii="Consolas" w:cs="Consolas" w:eastAsia="Consolas" w:hAnsi="Consolas"/>
-        </w:rPr>
-        <w:t xml:space="preserve">.regionalar_license</w:t>
-      </w:r>
-      <w:r>
-        <w:t xml:space="preserve"> in your user folder. Deleting this file removes the local license activation. Processed volume files (.vol, .bmsh, .vmsh, .nmsh, .omsh) created by the Desktop Companion are written to a folder you choose; you may delete them at any time.</w:t>
-      </w:r>
-    </w:p>
-    <w:p>
-      <w:pPr>
-        <w:pStyle w:val="Heading3"/>
-        <w:spacing w:after="100" w:before="200"/>
-      </w:pPr>
-      <w:r>
-        <w:rPr>
-          <w:b/>
-          <w:bCs/>
-          <w:color w:val="444444"/>
-          <w:sz w:val="24"/>
-          <w:szCs w:val="24"/>
-        </w:rPr>
-        <w:t xml:space="preserve">4. Email-based deletion request</w:t>
-      </w:r>
-    </w:p>
-    <w:p>
-      <w:pPr>
-        <w:spacing w:after="120"/>
-      </w:pPr>
-      <w:r>
-        <w:t xml:space="preserve">If you have any other concern about data potentially associated with your use of RegionalAR, you may email </w:t>
-      </w:r>
-      <w:hyperlink w:history="1" r:id="rId0sck8dhipe1v27iumrnza">
+        <w:t xml:space="preserve"> stops Meta from supplying further data. To request deletion of any other data, email the developer; we will respond within 30 days.</w:t>
+      </w:r>
+    </w:p>
+    <w:p>
+      <w:pPr>
+        <w:pStyle w:val="Heading2"/>
+        <w:spacing w:after="100" w:before="240"/>
+      </w:pPr>
+      <w:r>
+        <w:rPr>
+          <w:b/>
+          <w:bCs/>
+          <w:color w:val="0066CC"/>
+          <w:sz w:val="26"/>
+          <w:szCs w:val="26"/>
+        </w:rPr>
+        <w:t xml:space="preserve">Children</w:t>
+      </w:r>
+    </w:p>
+    <w:p>
+      <w:pPr>
+        <w:spacing w:after="120"/>
+      </w:pPr>
+      <w:r>
+        <w:t xml:space="preserve">RegionalAR is intended for medical professionals, students, and adult learners. It is not directed at children under 13, and the Meta age category check is used to gate access to age-appropriate users. We do not knowingly collect data from children under 13.</w:t>
+      </w:r>
+    </w:p>
+    <w:p>
+      <w:pPr>
+        <w:pStyle w:val="Heading2"/>
+        <w:spacing w:after="100" w:before="240"/>
+      </w:pPr>
+      <w:r>
+        <w:rPr>
+          <w:b/>
+          <w:bCs/>
+          <w:color w:val="0066CC"/>
+          <w:sz w:val="26"/>
+          <w:szCs w:val="26"/>
+        </w:rPr>
+        <w:t xml:space="preserve">Applicable Laws</w:t>
+      </w:r>
+    </w:p>
+    <w:p>
+      <w:pPr>
+        <w:spacing w:after="120"/>
+      </w:pPr>
+      <w:r>
+        <w:t xml:space="preserve">This policy is intended to comply with applicable data protection laws including GDPR, CCPA/CPRA, VCDPA, CPA, CTDPA, UCPA, COPPA, and LGPD. The rights above apply to all users; users in jurisdictions with additional statutory rights retain those rights in full. This policy is also subject to Meta's Developer Data Use Policy; where any conflict exists, the more protective provision applies.</w:t>
+      </w:r>
+    </w:p>
+    <w:p>
+      <w:pPr>
+        <w:pStyle w:val="Heading2"/>
+        <w:spacing w:after="100" w:before="240"/>
+      </w:pPr>
+      <w:r>
+        <w:rPr>
+          <w:b/>
+          <w:bCs/>
+          <w:color w:val="0066CC"/>
+          <w:sz w:val="26"/>
+          <w:szCs w:val="26"/>
+        </w:rPr>
+        <w:t xml:space="preserve">Medical Disclaimer</w:t>
+      </w:r>
+    </w:p>
+    <w:p>
+      <w:pPr>
+        <w:spacing w:after="120"/>
+      </w:pPr>
+      <w:r>
+        <w:t xml:space="preserve">RegionalAR is an educational and training tool. It is not a medical device, has not been cleared by the FDA or any regulatory body for clinical use, and must not be used for diagnosis, treatment planning, or patient care.</w:t>
+      </w:r>
+    </w:p>
+    <w:p>
+      <w:pPr>
+        <w:pStyle w:val="Heading2"/>
+        <w:spacing w:after="100" w:before="240"/>
+      </w:pPr>
+      <w:r>
+        <w:rPr>
+          <w:b/>
+          <w:bCs/>
+          <w:color w:val="0066CC"/>
+          <w:sz w:val="26"/>
+          <w:szCs w:val="26"/>
+        </w:rPr>
+        <w:t xml:space="preserve">Contact</w:t>
+      </w:r>
+    </w:p>
+    <w:p>
+      <w:pPr>
+        <w:spacing w:after="120"/>
+      </w:pPr>
+      <w:r>
+        <w:t xml:space="preserve">Laurence Henson, MD  ·  </w:t>
+      </w:r>
+      <w:hyperlink w:history="1" r:id="rIdypvl0gcc8z581jbnwotjr">
         <w:r>
           <w:rPr>
             <w:rStyle w:val="Hyperlink"/>
@@ -828,127 +755,52 @@
           <w:t xml:space="preserve">laurence.cyril.henson@gmail.com</w:t>
         </w:r>
       </w:hyperlink>
-      <w:r>
-        <w:t xml:space="preserve"> with the subject "RegionalAR Data Deletion Request." We will respond within 30 days. Please note that because the App does not transmit user data to the developer, there is in practice no developer-held data to remove; this address exists so that any user concern can still be acknowledged and addressed.</w:t>
-      </w:r>
-    </w:p>
-    <w:p>
-      <w:pPr>
-        <w:pStyle w:val="Heading2"/>
-        <w:spacing w:after="140" w:before="280"/>
-      </w:pPr>
-      <w:r>
-        <w:rPr>
-          <w:b/>
-          <w:bCs/>
-          <w:color w:val="0066CC"/>
-          <w:sz w:val="28"/>
-          <w:szCs w:val="28"/>
-        </w:rPr>
-        <w:t xml:space="preserve">Children's Privacy</w:t>
-      </w:r>
-    </w:p>
-    <w:p>
-      <w:pPr>
-        <w:spacing w:after="120"/>
-      </w:pPr>
-      <w:r>
-        <w:t xml:space="preserve">RegionalAR is intended for medical professionals, medical students, and adult learners. It is not directed at children under 13, and the Meta Horizon Platform's age category check is used to gate access accordingly. The developer does not knowingly collect information from children.</w:t>
-      </w:r>
-    </w:p>
-    <w:p>
-      <w:pPr>
-        <w:pStyle w:val="Heading2"/>
-        <w:spacing w:after="140" w:before="280"/>
-      </w:pPr>
-      <w:r>
-        <w:rPr>
-          <w:b/>
-          <w:bCs/>
-          <w:color w:val="0066CC"/>
-          <w:sz w:val="28"/>
-          <w:szCs w:val="28"/>
-        </w:rPr>
-        <w:t xml:space="preserve">Medical Disclaimer</w:t>
-      </w:r>
-    </w:p>
-    <w:p>
-      <w:pPr>
-        <w:spacing w:after="120"/>
-      </w:pPr>
-      <w:r>
-        <w:t xml:space="preserve">RegionalAR is an educational and training tool. It is not a medical device, is not intended for clinical diagnosis, treatment planning, or patient care, and has not been cleared by the FDA or any other regulatory body for clinical use. Visualizations are provided for educational purposes only and must not be used as a substitute for professional medical judgment.</w:t>
-      </w:r>
-    </w:p>
-    <w:p>
-      <w:pPr>
-        <w:pStyle w:val="Heading2"/>
-        <w:spacing w:after="140" w:before="280"/>
-      </w:pPr>
-      <w:r>
-        <w:rPr>
-          <w:b/>
-          <w:bCs/>
-          <w:color w:val="0066CC"/>
-          <w:sz w:val="28"/>
-          <w:szCs w:val="28"/>
-        </w:rPr>
-        <w:t xml:space="preserve">Changes to This Policy</w:t>
-      </w:r>
-    </w:p>
-    <w:p>
-      <w:pPr>
-        <w:spacing w:after="120"/>
-      </w:pPr>
-      <w:r>
-        <w:t xml:space="preserve">If we update this privacy policy, we will revise the "Last updated" date at the top of this document. Material changes that affect what data is collected or how it is used will be reflected in this document before they take effect in the App.</w:t>
-      </w:r>
-    </w:p>
-    <w:p>
-      <w:pPr>
-        <w:pStyle w:val="Heading2"/>
-        <w:spacing w:after="140" w:before="280"/>
-      </w:pPr>
-      <w:r>
-        <w:rPr>
-          <w:b/>
-          <w:bCs/>
-          <w:color w:val="0066CC"/>
-          <w:sz w:val="28"/>
-          <w:szCs w:val="28"/>
-        </w:rPr>
-        <w:t xml:space="preserve">Contact</w:t>
-      </w:r>
-    </w:p>
-    <w:p>
-      <w:pPr>
-        <w:spacing w:after="120"/>
-      </w:pPr>
-      <w:r>
-        <w:t xml:space="preserve">For questions about this privacy policy or to make a data-related request:</w:t>
-      </w:r>
-    </w:p>
-    <w:p>
-      <w:pPr>
-        <w:spacing w:after="120"/>
-      </w:pPr>
-      <w:r>
-        <w:t xml:space="preserve">Laurence Henson, MD</w:t>
-      </w:r>
-      <w:r>
-        <w:br/>
+    </w:p>
+    <w:p>
+      <w:pPr>
+        <w:pBdr>
+          <w:top w:val="single" w:color="DDDDDD" w:sz="4" w:space="8"/>
+        </w:pBdr>
+        <w:spacing w:before="320"/>
+      </w:pPr>
+      <w:r>
+        <w:rPr>
+          <w:sz w:val="4"/>
+          <w:szCs w:val="4"/>
+        </w:rPr>
         <w:t xml:space="preserve"/>
       </w:r>
-      <w:hyperlink w:history="1" r:id="rIdlhhewmbl2_tgylzdwcox2">
+    </w:p>
+    <w:p>
+      <w:pPr>
+        <w:spacing w:after="120"/>
+      </w:pPr>
+      <w:r>
+        <w:rPr>
+          <w:color w:val="666666"/>
+          <w:sz w:val="18"/>
+          <w:szCs w:val="18"/>
+        </w:rPr>
+        <w:t xml:space="preserve">If we update this policy, the date at the top will change. The current version is always at </w:t>
+      </w:r>
+      <w:hyperlink w:history="1" r:id="rIdjofolxlkdszotwzvfcuxl">
         <w:r>
           <w:rPr>
             <w:rStyle w:val="Hyperlink"/>
             <w:color w:val="0066CC"/>
             <w:u w:val="single"/>
           </w:rPr>
-          <w:t xml:space="preserve">laurence.cyril.henson@gmail.com</w:t>
+          <w:t xml:space="preserve">cyrilhenson.github.io/RegionalAR/privacy-policy.html</w:t>
         </w:r>
       </w:hyperlink>
+      <w:r>
+        <w:rPr>
+          <w:color w:val="666666"/>
+          <w:sz w:val="18"/>
+          <w:szCs w:val="18"/>
+        </w:rPr>
+        <w:t xml:space="preserve">.</w:t>
+      </w:r>
     </w:p>
     <w:sectPr>
       <w:pgSz w:w="12240" w:h="15840" w:orient="portrait"/>
@@ -1341,7 +1193,7 @@
     <w:next w:val="Normal"/>
     <w:qFormat/>
     <w:pPr>
-      <w:spacing w:after="200" w:before="240"/>
+      <w:spacing w:after="120" w:before="240"/>
       <w:outlineLvl w:val="0"/>
     </w:pPr>
     <w:rPr>
@@ -1359,7 +1211,7 @@
     <w:next w:val="Normal"/>
     <w:qFormat/>
     <w:pPr>
-      <w:spacing w:after="140" w:before="280"/>
+      <w:spacing w:after="100" w:before="240"/>
       <w:outlineLvl w:val="1"/>
     </w:pPr>
     <w:rPr>
@@ -1367,26 +1219,8 @@
       <w:b/>
       <w:bCs/>
       <w:color w:val="0066CC"/>
-      <w:sz w:val="28"/>
-      <w:szCs w:val="28"/>
-    </w:rPr>
-  </w:style>
-  <w:style w:type="paragraph" w:styleId="Heading3">
-    <w:name w:val="Heading 3"/>
-    <w:basedOn w:val="Normal"/>
-    <w:next w:val="Normal"/>
-    <w:qFormat/>
-    <w:pPr>
-      <w:spacing w:after="100" w:before="200"/>
-      <w:outlineLvl w:val="2"/>
-    </w:pPr>
-    <w:rPr>
-      <w:rFonts w:ascii="Arial" w:cs="Arial" w:eastAsia="Arial" w:hAnsi="Arial"/>
-      <w:b/>
-      <w:bCs/>
-      <w:color w:val="444444"/>
-      <w:sz w:val="24"/>
-      <w:szCs w:val="24"/>
+      <w:sz w:val="26"/>
+      <w:szCs w:val="26"/>
     </w:rPr>
   </w:style>
 </w:styles>

</xml_diff>